<commit_message>
feat: add phone number recovery and reset functionality
- Implemented API routes for requesting and resetting passwords via phone number.
- Added normalization for Ghana phone numbers.
- Integrated email and SMS services for password reset confirmation.
- Created tests for phone number normalization and markdown sanitization.
- Added markdown sanitization utility to remove unsafe content.
- Included new image and document files in the chapters directory.
</commit_message>
<xml_diff>
--- a/docs/Chapters/Smart Information Dissemination System - Chapter 3.docx
+++ b/docs/Chapters/Smart Information Dissemination System - Chapter 3.docx
@@ -4342,10 +4342,10 @@
         </w:rPr>
         <w:lastRenderedPageBreak/>
         <w:drawing>
-          <wp:inline distT="0" distB="0" distL="0" distR="0" wp14:anchorId="7F05F6D2" wp14:editId="22DABF91">
-            <wp:extent cx="5852160" cy="6217920"/>
-            <wp:effectExtent l="0" t="0" r="0" b="0"/>
-            <wp:docPr id="1" name="Picture 1"/>
+          <wp:inline distT="0" distB="0" distL="0" distR="0" wp14:anchorId="059BF007" wp14:editId="4308C04E">
+            <wp:extent cx="6217920" cy="4399915"/>
+            <wp:effectExtent l="0" t="0" r="0" b="635"/>
+            <wp:docPr id="774918339" name="Picture 3"/>
             <wp:cNvGraphicFramePr>
               <a:graphicFrameLocks xmlns:a="http://schemas.openxmlformats.org/drawingml/2006/main" noChangeAspect="1"/>
             </wp:cNvGraphicFramePr>
@@ -4353,7 +4353,7 @@
               <a:graphicData uri="http://schemas.openxmlformats.org/drawingml/2006/picture">
                 <pic:pic xmlns:pic="http://schemas.openxmlformats.org/drawingml/2006/picture">
                   <pic:nvPicPr>
-                    <pic:cNvPr id="0" name="architecture_overview.png"/>
+                    <pic:cNvPr id="774918339" name="Picture 774918339"/>
                     <pic:cNvPicPr/>
                   </pic:nvPicPr>
                   <pic:blipFill>
@@ -4365,7 +4365,7 @@
                   <pic:spPr>
                     <a:xfrm>
                       <a:off x="0" y="0"/>
-                      <a:ext cx="5852160" cy="6217920"/>
+                      <a:ext cx="6217920" cy="4399915"/>
                     </a:xfrm>
                     <a:prstGeom prst="rect">
                       <a:avLst/>
@@ -4385,22 +4385,6 @@
         <w:rPr>
           <w:rFonts w:cs="Times New Roman"/>
         </w:rPr>
-      </w:pPr>
-      <w:r>
-        <w:rPr>
-          <w:rFonts w:cs="Times New Roman"/>
-          <w:i/>
-          <w:sz w:val="20"/>
-        </w:rPr>
-        <w:t>Figure 3.1: High-level system architecture of the Smart Information Dissemination System</w:t>
-      </w:r>
-    </w:p>
-    <w:p>
-      <w:pPr>
-        <w:spacing w:line="240" w:lineRule="auto"/>
-        <w:rPr>
-          <w:rFonts w:cs="Times New Roman"/>
-        </w:rPr>
         <w:sectPr>
           <w:footerReference w:type="default" r:id="rId9"/>
           <w:pgSz w:w="12240" w:h="15840"/>
@@ -4410,10 +4394,193 @@
           <w:docGrid w:linePitch="360"/>
         </w:sectPr>
       </w:pPr>
+      <w:r>
+        <w:rPr>
+          <w:rFonts w:cs="Times New Roman"/>
+          <w:i/>
+          <w:sz w:val="20"/>
+        </w:rPr>
+        <w:t>Figure 3.1: High-level system architecture of the Smart Information Dissemination System</w:t>
+      </w:r>
     </w:p>
     <w:p>
       <w:pPr>
         <w:spacing w:line="240" w:lineRule="auto"/>
+        <w:rPr>
+          <w:rFonts w:cs="Times New Roman"/>
+        </w:rPr>
+        <w:sectPr>
+          <w:type w:val="continuous"/>
+          <w:pgSz w:w="12240" w:h="15840"/>
+          <w:pgMar w:top="1296" w:right="1224" w:bottom="1152" w:left="1224" w:header="432" w:footer="504" w:gutter="0"/>
+          <w:pgNumType w:start="1"/>
+          <w:cols w:space="720"/>
+          <w:docGrid w:linePitch="360"/>
+        </w:sectPr>
+      </w:pPr>
+    </w:p>
+    <w:p>
+      <w:pPr>
+        <w:spacing w:line="240" w:lineRule="auto"/>
+        <w:rPr>
+          <w:rFonts w:cs="Times New Roman"/>
+        </w:rPr>
+      </w:pPr>
+    </w:p>
+    <w:p>
+      <w:pPr>
+        <w:spacing w:line="240" w:lineRule="auto"/>
+        <w:rPr>
+          <w:rFonts w:cs="Times New Roman"/>
+        </w:rPr>
+      </w:pPr>
+    </w:p>
+    <w:p>
+      <w:pPr>
+        <w:spacing w:line="240" w:lineRule="auto"/>
+        <w:rPr>
+          <w:rFonts w:cs="Times New Roman"/>
+        </w:rPr>
+      </w:pPr>
+    </w:p>
+    <w:p>
+      <w:pPr>
+        <w:spacing w:line="240" w:lineRule="auto"/>
+        <w:rPr>
+          <w:rFonts w:cs="Times New Roman"/>
+        </w:rPr>
+      </w:pPr>
+    </w:p>
+    <w:p>
+      <w:pPr>
+        <w:spacing w:line="240" w:lineRule="auto"/>
+        <w:rPr>
+          <w:rFonts w:cs="Times New Roman"/>
+        </w:rPr>
+      </w:pPr>
+    </w:p>
+    <w:p>
+      <w:pPr>
+        <w:spacing w:line="240" w:lineRule="auto"/>
+        <w:rPr>
+          <w:rFonts w:cs="Times New Roman"/>
+        </w:rPr>
+      </w:pPr>
+    </w:p>
+    <w:p>
+      <w:pPr>
+        <w:spacing w:line="240" w:lineRule="auto"/>
+        <w:rPr>
+          <w:rFonts w:cs="Times New Roman"/>
+        </w:rPr>
+      </w:pPr>
+    </w:p>
+    <w:p>
+      <w:pPr>
+        <w:spacing w:line="240" w:lineRule="auto"/>
+        <w:rPr>
+          <w:rFonts w:cs="Times New Roman"/>
+        </w:rPr>
+      </w:pPr>
+    </w:p>
+    <w:p>
+      <w:pPr>
+        <w:spacing w:line="240" w:lineRule="auto"/>
+        <w:rPr>
+          <w:rFonts w:cs="Times New Roman"/>
+        </w:rPr>
+      </w:pPr>
+    </w:p>
+    <w:p>
+      <w:pPr>
+        <w:spacing w:line="240" w:lineRule="auto"/>
+        <w:rPr>
+          <w:rFonts w:cs="Times New Roman"/>
+        </w:rPr>
+      </w:pPr>
+    </w:p>
+    <w:p>
+      <w:pPr>
+        <w:spacing w:line="240" w:lineRule="auto"/>
+        <w:rPr>
+          <w:rFonts w:cs="Times New Roman"/>
+        </w:rPr>
+      </w:pPr>
+    </w:p>
+    <w:p>
+      <w:pPr>
+        <w:spacing w:line="240" w:lineRule="auto"/>
+        <w:rPr>
+          <w:rFonts w:cs="Times New Roman"/>
+        </w:rPr>
+      </w:pPr>
+    </w:p>
+    <w:p>
+      <w:pPr>
+        <w:spacing w:line="240" w:lineRule="auto"/>
+        <w:rPr>
+          <w:rFonts w:cs="Times New Roman"/>
+        </w:rPr>
+        <w:sectPr>
+          <w:type w:val="continuous"/>
+          <w:pgSz w:w="12240" w:h="15840"/>
+          <w:pgMar w:top="1296" w:right="1224" w:bottom="1152" w:left="1224" w:header="432" w:footer="504" w:gutter="0"/>
+          <w:pgNumType w:start="1"/>
+          <w:cols w:space="720"/>
+          <w:docGrid w:linePitch="360"/>
+        </w:sectPr>
+      </w:pPr>
+    </w:p>
+    <w:p>
+      <w:pPr>
+        <w:pStyle w:val="Heading4"/>
+        <w:spacing w:line="240" w:lineRule="auto"/>
+        <w:rPr>
+          <w:rFonts w:cs="Times New Roman"/>
+        </w:rPr>
+      </w:pPr>
+      <w:r>
+        <w:rPr>
+          <w:rFonts w:cs="Times New Roman"/>
+        </w:rPr>
+        <w:lastRenderedPageBreak/>
+        <w:t>3.8.3.2 System Flowchart</w:t>
+      </w:r>
+    </w:p>
+    <w:p>
+      <w:pPr>
+        <w:spacing w:line="240" w:lineRule="auto"/>
+        <w:ind w:firstLine="461"/>
+        <w:rPr>
+          <w:rFonts w:cs="Times New Roman"/>
+        </w:rPr>
+      </w:pPr>
+      <w:r>
+        <w:rPr>
+          <w:rFonts w:cs="Times New Roman"/>
+        </w:rPr>
+        <w:t>The system flowchart presents the main operational paths across authentication, role detection, institution and user management, announcement creation, audience selection, approval and publication, messaging, academic schedules, notification generation, external delivery, read tracking, reporting, and audit logging. Decision points reject invalid credentials, unauthorized actions, incomplete content, invalid audiences, and failed provider responses.</w:t>
+      </w:r>
+    </w:p>
+    <w:p>
+      <w:pPr>
+        <w:spacing w:line="240" w:lineRule="auto"/>
+        <w:rPr>
+          <w:rFonts w:cs="Times New Roman"/>
+        </w:rPr>
+        <w:sectPr>
+          <w:type w:val="continuous"/>
+          <w:pgSz w:w="12240" w:h="15840"/>
+          <w:pgMar w:top="1296" w:right="1224" w:bottom="1152" w:left="1224" w:header="432" w:footer="504" w:gutter="0"/>
+          <w:pgNumType w:start="1"/>
+          <w:cols w:space="720"/>
+          <w:docGrid w:linePitch="360"/>
+        </w:sectPr>
+      </w:pPr>
+    </w:p>
+    <w:p>
+      <w:pPr>
+        <w:spacing w:line="240" w:lineRule="auto"/>
         <w:jc w:val="center"/>
         <w:rPr>
           <w:rFonts w:cs="Times New Roman"/>
@@ -4424,12 +4591,11 @@
           <w:rFonts w:cs="Times New Roman"/>
           <w:noProof/>
         </w:rPr>
-        <w:lastRenderedPageBreak/>
         <w:drawing>
-          <wp:inline distT="0" distB="0" distL="0" distR="0" wp14:anchorId="3CF3D918" wp14:editId="71DC4921">
-            <wp:extent cx="5989320" cy="2541685"/>
-            <wp:effectExtent l="0" t="0" r="0" b="0"/>
-            <wp:docPr id="2" name="Picture 2"/>
+          <wp:inline distT="0" distB="0" distL="0" distR="0" wp14:anchorId="04E023CA" wp14:editId="4D0E89DB">
+            <wp:extent cx="6217920" cy="4399915"/>
+            <wp:effectExtent l="0" t="0" r="0" b="635"/>
+            <wp:docPr id="976977441" name="Picture 2"/>
             <wp:cNvGraphicFramePr>
               <a:graphicFrameLocks xmlns:a="http://schemas.openxmlformats.org/drawingml/2006/main" noChangeAspect="1"/>
             </wp:cNvGraphicFramePr>
@@ -4437,7 +4603,7 @@
               <a:graphicData uri="http://schemas.openxmlformats.org/drawingml/2006/picture">
                 <pic:pic xmlns:pic="http://schemas.openxmlformats.org/drawingml/2006/picture">
                   <pic:nvPicPr>
-                    <pic:cNvPr id="0" name="architecture_part_1.png"/>
+                    <pic:cNvPr id="976977441" name="Picture 976977441"/>
                     <pic:cNvPicPr/>
                   </pic:nvPicPr>
                   <pic:blipFill>
@@ -4449,7 +4615,7 @@
                   <pic:spPr>
                     <a:xfrm>
                       <a:off x="0" y="0"/>
-                      <a:ext cx="5989320" cy="2541685"/>
+                      <a:ext cx="6217920" cy="4399915"/>
                     </a:xfrm>
                     <a:prstGeom prst="rect">
                       <a:avLst/>
@@ -4476,7 +4642,7 @@
           <w:i/>
           <w:sz w:val="20"/>
         </w:rPr>
-        <w:t>Figure 3.1a: Architecture detail - system users, presentation portals, and client-state services</w:t>
+        <w:t>Figure 3.2: Overview of the Smart Information Dissemination System flowchart</w:t>
       </w:r>
     </w:p>
     <w:p>
@@ -4514,6 +4680,125 @@
     <w:p>
       <w:pPr>
         <w:spacing w:line="240" w:lineRule="auto"/>
+        <w:rPr>
+          <w:rFonts w:cs="Times New Roman"/>
+        </w:rPr>
+      </w:pPr>
+    </w:p>
+    <w:p>
+      <w:pPr>
+        <w:spacing w:line="240" w:lineRule="auto"/>
+        <w:rPr>
+          <w:rFonts w:cs="Times New Roman"/>
+        </w:rPr>
+      </w:pPr>
+    </w:p>
+    <w:p>
+      <w:pPr>
+        <w:spacing w:line="240" w:lineRule="auto"/>
+        <w:rPr>
+          <w:rFonts w:cs="Times New Roman"/>
+        </w:rPr>
+      </w:pPr>
+    </w:p>
+    <w:p>
+      <w:pPr>
+        <w:spacing w:line="240" w:lineRule="auto"/>
+        <w:rPr>
+          <w:rFonts w:cs="Times New Roman"/>
+        </w:rPr>
+      </w:pPr>
+    </w:p>
+    <w:p>
+      <w:pPr>
+        <w:spacing w:line="240" w:lineRule="auto"/>
+        <w:rPr>
+          <w:rFonts w:cs="Times New Roman"/>
+        </w:rPr>
+      </w:pPr>
+    </w:p>
+    <w:p>
+      <w:pPr>
+        <w:spacing w:line="240" w:lineRule="auto"/>
+        <w:rPr>
+          <w:rFonts w:cs="Times New Roman"/>
+        </w:rPr>
+      </w:pPr>
+    </w:p>
+    <w:p>
+      <w:pPr>
+        <w:spacing w:line="240" w:lineRule="auto"/>
+        <w:rPr>
+          <w:rFonts w:cs="Times New Roman"/>
+        </w:rPr>
+      </w:pPr>
+    </w:p>
+    <w:p>
+      <w:pPr>
+        <w:spacing w:line="240" w:lineRule="auto"/>
+        <w:rPr>
+          <w:rFonts w:cs="Times New Roman"/>
+        </w:rPr>
+        <w:sectPr>
+          <w:type w:val="continuous"/>
+          <w:pgSz w:w="12240" w:h="15840"/>
+          <w:pgMar w:top="1296" w:right="1224" w:bottom="1152" w:left="1224" w:header="432" w:footer="504" w:gutter="0"/>
+          <w:pgNumType w:start="1"/>
+          <w:cols w:space="720"/>
+          <w:docGrid w:linePitch="360"/>
+        </w:sectPr>
+      </w:pPr>
+    </w:p>
+    <w:p>
+      <w:pPr>
+        <w:pStyle w:val="Heading4"/>
+        <w:spacing w:line="240" w:lineRule="auto"/>
+        <w:rPr>
+          <w:rFonts w:cs="Times New Roman"/>
+        </w:rPr>
+      </w:pPr>
+      <w:r>
+        <w:rPr>
+          <w:rFonts w:cs="Times New Roman"/>
+        </w:rPr>
+        <w:lastRenderedPageBreak/>
+        <w:t>3.8.3.3 Entity-Relationship Diagram and Database Design</w:t>
+      </w:r>
+    </w:p>
+    <w:p>
+      <w:pPr>
+        <w:spacing w:line="240" w:lineRule="auto"/>
+        <w:ind w:firstLine="461"/>
+        <w:rPr>
+          <w:rFonts w:cs="Times New Roman"/>
+        </w:rPr>
+      </w:pPr>
+      <w:r>
+        <w:rPr>
+          <w:rFonts w:cs="Times New Roman"/>
+        </w:rPr>
+        <w:t>The Entity-Relationship Diagram defines the data required to preserve users, roles, permissions, institutional structures, announcements, audiences, recipients, attachments, messages, threads, schedules, notifications, delivery records, preferences, sessions, reports, and audit logs. Primary keys identify records, while foreign keys and join entities preserve many-to-many relationships such as users and roles, roles and permissions, announcements and audiences, threads and participants, students and courses, and notices and recipients.</w:t>
+      </w:r>
+    </w:p>
+    <w:p>
+      <w:pPr>
+        <w:spacing w:line="240" w:lineRule="auto"/>
+        <w:rPr>
+          <w:rFonts w:cs="Times New Roman"/>
+        </w:rPr>
+        <w:sectPr>
+          <w:type w:val="continuous"/>
+          <w:pgSz w:w="12240" w:h="15840"/>
+          <w:pgMar w:top="1296" w:right="1224" w:bottom="1152" w:left="1224" w:header="432" w:footer="504" w:gutter="0"/>
+          <w:pgNumType w:start="1"/>
+          <w:cols w:space="720"/>
+          <w:docGrid w:linePitch="360"/>
+        </w:sectPr>
+      </w:pPr>
+    </w:p>
+    <w:p>
+      <w:pPr>
+        <w:spacing w:line="240" w:lineRule="auto"/>
         <w:jc w:val="center"/>
         <w:rPr>
           <w:rFonts w:cs="Times New Roman"/>
@@ -4525,10 +4810,10 @@
           <w:noProof/>
         </w:rPr>
         <w:drawing>
-          <wp:inline distT="0" distB="0" distL="0" distR="0" wp14:anchorId="2AEE67E8" wp14:editId="1714FEEF">
-            <wp:extent cx="5989320" cy="2695194"/>
+          <wp:inline distT="0" distB="0" distL="0" distR="0" wp14:anchorId="264B6274" wp14:editId="2FF52457">
+            <wp:extent cx="6217920" cy="4178243"/>
             <wp:effectExtent l="0" t="0" r="0" b="0"/>
-            <wp:docPr id="3" name="Picture 3"/>
+            <wp:docPr id="355523453" name="Picture 1"/>
             <wp:cNvGraphicFramePr>
               <a:graphicFrameLocks xmlns:a="http://schemas.openxmlformats.org/drawingml/2006/main" noChangeAspect="1"/>
             </wp:cNvGraphicFramePr>
@@ -4536,23 +4821,32 @@
               <a:graphicData uri="http://schemas.openxmlformats.org/drawingml/2006/picture">
                 <pic:pic xmlns:pic="http://schemas.openxmlformats.org/drawingml/2006/picture">
                   <pic:nvPicPr>
-                    <pic:cNvPr id="0" name="architecture_part_2.png"/>
+                    <pic:cNvPr id="355523453" name="Picture 355523453"/>
                     <pic:cNvPicPr/>
                   </pic:nvPicPr>
-                  <pic:blipFill>
+                  <pic:blipFill rotWithShape="1">
                     <a:blip r:embed="rId11"/>
+                    <a:srcRect t="5038"/>
                     <a:stretch>
                       <a:fillRect/>
                     </a:stretch>
                   </pic:blipFill>
-                  <pic:spPr>
+                  <pic:spPr bwMode="auto">
                     <a:xfrm>
                       <a:off x="0" y="0"/>
-                      <a:ext cx="5989320" cy="2695194"/>
+                      <a:ext cx="6217920" cy="4178243"/>
                     </a:xfrm>
                     <a:prstGeom prst="rect">
                       <a:avLst/>
                     </a:prstGeom>
+                    <a:ln>
+                      <a:noFill/>
+                    </a:ln>
+                    <a:extLst>
+                      <a:ext uri="{53640926-AAD7-44D8-BBD7-CCE9431645EC}">
+                        <a14:shadowObscured xmlns:a14="http://schemas.microsoft.com/office/drawing/2010/main"/>
+                      </a:ext>
+                    </a:extLst>
                   </pic:spPr>
                 </pic:pic>
               </a:graphicData>
@@ -4568,22 +4862,6 @@
         <w:rPr>
           <w:rFonts w:cs="Times New Roman"/>
         </w:rPr>
-      </w:pPr>
-      <w:r>
-        <w:rPr>
-          <w:rFonts w:cs="Times New Roman"/>
-          <w:i/>
-          <w:sz w:val="20"/>
-        </w:rPr>
-        <w:t>Figure 3.1b: Architecture detail - API security and application business services</w:t>
-      </w:r>
-    </w:p>
-    <w:p>
-      <w:pPr>
-        <w:spacing w:line="240" w:lineRule="auto"/>
-        <w:rPr>
-          <w:rFonts w:cs="Times New Roman"/>
-        </w:rPr>
         <w:sectPr>
           <w:type w:val="continuous"/>
           <w:pgSz w:w="12240" w:h="15840"/>
@@ -4593,1444 +4871,13 @@
           <w:docGrid w:linePitch="360"/>
         </w:sectPr>
       </w:pPr>
-    </w:p>
-    <w:p>
-      <w:pPr>
-        <w:spacing w:line="240" w:lineRule="auto"/>
-        <w:rPr>
-          <w:rFonts w:cs="Times New Roman"/>
-        </w:rPr>
-        <w:sectPr>
-          <w:type w:val="continuous"/>
-          <w:pgSz w:w="12240" w:h="15840"/>
-          <w:pgMar w:top="1296" w:right="1224" w:bottom="1152" w:left="1224" w:header="432" w:footer="504" w:gutter="0"/>
-          <w:pgNumType w:start="1"/>
-          <w:cols w:space="720"/>
-          <w:docGrid w:linePitch="360"/>
-        </w:sectPr>
-      </w:pPr>
-    </w:p>
-    <w:p>
-      <w:pPr>
-        <w:spacing w:line="240" w:lineRule="auto"/>
-        <w:jc w:val="center"/>
-        <w:rPr>
-          <w:rFonts w:cs="Times New Roman"/>
-        </w:rPr>
-      </w:pPr>
-      <w:r>
-        <w:rPr>
-          <w:rFonts w:cs="Times New Roman"/>
-          <w:noProof/>
-        </w:rPr>
-        <w:drawing>
-          <wp:inline distT="0" distB="0" distL="0" distR="0" wp14:anchorId="1B84CD86" wp14:editId="50CD5815">
-            <wp:extent cx="5989320" cy="2093744"/>
-            <wp:effectExtent l="0" t="0" r="0" b="0"/>
-            <wp:docPr id="4" name="Picture 4"/>
-            <wp:cNvGraphicFramePr>
-              <a:graphicFrameLocks xmlns:a="http://schemas.openxmlformats.org/drawingml/2006/main" noChangeAspect="1"/>
-            </wp:cNvGraphicFramePr>
-            <a:graphic xmlns:a="http://schemas.openxmlformats.org/drawingml/2006/main">
-              <a:graphicData uri="http://schemas.openxmlformats.org/drawingml/2006/picture">
-                <pic:pic xmlns:pic="http://schemas.openxmlformats.org/drawingml/2006/picture">
-                  <pic:nvPicPr>
-                    <pic:cNvPr id="0" name="architecture_part_3.png"/>
-                    <pic:cNvPicPr/>
-                  </pic:nvPicPr>
-                  <pic:blipFill>
-                    <a:blip r:embed="rId12"/>
-                    <a:stretch>
-                      <a:fillRect/>
-                    </a:stretch>
-                  </pic:blipFill>
-                  <pic:spPr>
-                    <a:xfrm>
-                      <a:off x="0" y="0"/>
-                      <a:ext cx="5989320" cy="2093744"/>
-                    </a:xfrm>
-                    <a:prstGeom prst="rect">
-                      <a:avLst/>
-                    </a:prstGeom>
-                  </pic:spPr>
-                </pic:pic>
-              </a:graphicData>
-            </a:graphic>
-          </wp:inline>
-        </w:drawing>
-      </w:r>
-    </w:p>
-    <w:p>
-      <w:pPr>
-        <w:spacing w:before="60" w:after="160" w:line="240" w:lineRule="auto"/>
-        <w:jc w:val="center"/>
-        <w:rPr>
-          <w:rFonts w:cs="Times New Roman"/>
-        </w:rPr>
-      </w:pPr>
       <w:r>
         <w:rPr>
           <w:rFonts w:cs="Times New Roman"/>
           <w:i/>
           <w:sz w:val="20"/>
         </w:rPr>
-        <w:lastRenderedPageBreak/>
-        <w:t>Figure 3.1c: Architecture detail - data access, database modules, and external services</w:t>
-      </w:r>
-    </w:p>
-    <w:p>
-      <w:pPr>
-        <w:spacing w:line="240" w:lineRule="auto"/>
-        <w:rPr>
-          <w:rFonts w:cs="Times New Roman"/>
-        </w:rPr>
-        <w:sectPr>
-          <w:type w:val="continuous"/>
-          <w:pgSz w:w="12240" w:h="15840"/>
-          <w:pgMar w:top="1296" w:right="1224" w:bottom="1152" w:left="1224" w:header="432" w:footer="504" w:gutter="0"/>
-          <w:pgNumType w:start="1"/>
-          <w:cols w:space="720"/>
-          <w:docGrid w:linePitch="360"/>
-        </w:sectPr>
-      </w:pPr>
-    </w:p>
-    <w:p>
-      <w:pPr>
-        <w:pStyle w:val="Heading4"/>
-        <w:spacing w:line="240" w:lineRule="auto"/>
-        <w:rPr>
-          <w:rFonts w:cs="Times New Roman"/>
-        </w:rPr>
-      </w:pPr>
-      <w:r>
-        <w:rPr>
-          <w:rFonts w:cs="Times New Roman"/>
-        </w:rPr>
-        <w:t>3.8.3.2 System Flowchart</w:t>
-      </w:r>
-    </w:p>
-    <w:p>
-      <w:pPr>
-        <w:spacing w:line="240" w:lineRule="auto"/>
-        <w:ind w:firstLine="461"/>
-        <w:rPr>
-          <w:rFonts w:cs="Times New Roman"/>
-        </w:rPr>
-      </w:pPr>
-      <w:r>
-        <w:rPr>
-          <w:rFonts w:cs="Times New Roman"/>
-        </w:rPr>
-        <w:t>The system flowchart presents the main operational paths across authentication, role detection, institution and user management, announcement creation, audience selection, approval and publication, messaging, academic schedules, notification generation, external delivery, read tracking, reporting, and audit logging. Decision points reject invalid credentials, unauthorized actions, incomplete content, invalid audiences, and failed provider responses.</w:t>
-      </w:r>
-    </w:p>
-    <w:p>
-      <w:pPr>
-        <w:spacing w:line="240" w:lineRule="auto"/>
-        <w:rPr>
-          <w:rFonts w:cs="Times New Roman"/>
-        </w:rPr>
-        <w:sectPr>
-          <w:type w:val="continuous"/>
-          <w:pgSz w:w="12240" w:h="15840"/>
-          <w:pgMar w:top="1296" w:right="1224" w:bottom="1152" w:left="1224" w:header="432" w:footer="504" w:gutter="0"/>
-          <w:pgNumType w:start="1"/>
-          <w:cols w:space="720"/>
-          <w:docGrid w:linePitch="360"/>
-        </w:sectPr>
-      </w:pPr>
-    </w:p>
-    <w:p>
-      <w:pPr>
-        <w:spacing w:line="240" w:lineRule="auto"/>
-        <w:jc w:val="center"/>
-        <w:rPr>
-          <w:rFonts w:cs="Times New Roman"/>
-        </w:rPr>
-      </w:pPr>
-      <w:r>
-        <w:rPr>
-          <w:rFonts w:cs="Times New Roman"/>
-          <w:noProof/>
-        </w:rPr>
-        <w:drawing>
-          <wp:inline distT="0" distB="0" distL="0" distR="0" wp14:anchorId="70B905A0" wp14:editId="0519CFD4">
-            <wp:extent cx="5989320" cy="4832270"/>
-            <wp:effectExtent l="0" t="0" r="0" b="0"/>
-            <wp:docPr id="5" name="Picture 5"/>
-            <wp:cNvGraphicFramePr>
-              <a:graphicFrameLocks xmlns:a="http://schemas.openxmlformats.org/drawingml/2006/main" noChangeAspect="1"/>
-            </wp:cNvGraphicFramePr>
-            <a:graphic xmlns:a="http://schemas.openxmlformats.org/drawingml/2006/main">
-              <a:graphicData uri="http://schemas.openxmlformats.org/drawingml/2006/picture">
-                <pic:pic xmlns:pic="http://schemas.openxmlformats.org/drawingml/2006/picture">
-                  <pic:nvPicPr>
-                    <pic:cNvPr id="0" name="flow_overview.png"/>
-                    <pic:cNvPicPr/>
-                  </pic:nvPicPr>
-                  <pic:blipFill>
-                    <a:blip r:embed="rId13"/>
-                    <a:stretch>
-                      <a:fillRect/>
-                    </a:stretch>
-                  </pic:blipFill>
-                  <pic:spPr>
-                    <a:xfrm>
-                      <a:off x="0" y="0"/>
-                      <a:ext cx="5989320" cy="4832270"/>
-                    </a:xfrm>
-                    <a:prstGeom prst="rect">
-                      <a:avLst/>
-                    </a:prstGeom>
-                  </pic:spPr>
-                </pic:pic>
-              </a:graphicData>
-            </a:graphic>
-          </wp:inline>
-        </w:drawing>
-      </w:r>
-    </w:p>
-    <w:p>
-      <w:pPr>
-        <w:spacing w:before="60" w:after="160" w:line="240" w:lineRule="auto"/>
-        <w:jc w:val="center"/>
-        <w:rPr>
-          <w:rFonts w:cs="Times New Roman"/>
-        </w:rPr>
-      </w:pPr>
-      <w:r>
-        <w:rPr>
-          <w:rFonts w:cs="Times New Roman"/>
-          <w:i/>
-          <w:sz w:val="20"/>
-        </w:rPr>
-        <w:t>Figure 3.2: Overview of the Smart Information Dissemination System flowchart</w:t>
-      </w:r>
-    </w:p>
-    <w:p>
-      <w:pPr>
-        <w:spacing w:line="240" w:lineRule="auto"/>
-        <w:rPr>
-          <w:rFonts w:cs="Times New Roman"/>
-        </w:rPr>
-        <w:sectPr>
-          <w:type w:val="continuous"/>
-          <w:pgSz w:w="12240" w:h="15840"/>
-          <w:pgMar w:top="1296" w:right="1224" w:bottom="1152" w:left="1224" w:header="432" w:footer="504" w:gutter="0"/>
-          <w:pgNumType w:start="1"/>
-          <w:cols w:space="720"/>
-          <w:docGrid w:linePitch="360"/>
-        </w:sectPr>
-      </w:pPr>
-    </w:p>
-    <w:p>
-      <w:pPr>
-        <w:spacing w:line="240" w:lineRule="auto"/>
-        <w:rPr>
-          <w:rFonts w:cs="Times New Roman"/>
-        </w:rPr>
-        <w:sectPr>
-          <w:type w:val="continuous"/>
-          <w:pgSz w:w="12240" w:h="15840"/>
-          <w:pgMar w:top="1296" w:right="1224" w:bottom="1152" w:left="1224" w:header="432" w:footer="504" w:gutter="0"/>
-          <w:pgNumType w:start="1"/>
-          <w:cols w:space="720"/>
-          <w:docGrid w:linePitch="360"/>
-        </w:sectPr>
-      </w:pPr>
-    </w:p>
-    <w:p>
-      <w:pPr>
-        <w:spacing w:line="240" w:lineRule="auto"/>
-        <w:jc w:val="center"/>
-        <w:rPr>
-          <w:rFonts w:cs="Times New Roman"/>
-        </w:rPr>
-      </w:pPr>
-      <w:r>
-        <w:rPr>
-          <w:rFonts w:cs="Times New Roman"/>
-          <w:noProof/>
-        </w:rPr>
-        <w:drawing>
-          <wp:inline distT="0" distB="0" distL="0" distR="0" wp14:anchorId="4A469F81" wp14:editId="1261E724">
-            <wp:extent cx="5989320" cy="1057692"/>
-            <wp:effectExtent l="0" t="0" r="0" b="0"/>
-            <wp:docPr id="6" name="Picture 6"/>
-            <wp:cNvGraphicFramePr>
-              <a:graphicFrameLocks xmlns:a="http://schemas.openxmlformats.org/drawingml/2006/main" noChangeAspect="1"/>
-            </wp:cNvGraphicFramePr>
-            <a:graphic xmlns:a="http://schemas.openxmlformats.org/drawingml/2006/main">
-              <a:graphicData uri="http://schemas.openxmlformats.org/drawingml/2006/picture">
-                <pic:pic xmlns:pic="http://schemas.openxmlformats.org/drawingml/2006/picture">
-                  <pic:nvPicPr>
-                    <pic:cNvPr id="0" name="flow_part_1.png"/>
-                    <pic:cNvPicPr/>
-                  </pic:nvPicPr>
-                  <pic:blipFill>
-                    <a:blip r:embed="rId14"/>
-                    <a:stretch>
-                      <a:fillRect/>
-                    </a:stretch>
-                  </pic:blipFill>
-                  <pic:spPr>
-                    <a:xfrm>
-                      <a:off x="0" y="0"/>
-                      <a:ext cx="5989320" cy="1057692"/>
-                    </a:xfrm>
-                    <a:prstGeom prst="rect">
-                      <a:avLst/>
-                    </a:prstGeom>
-                  </pic:spPr>
-                </pic:pic>
-              </a:graphicData>
-            </a:graphic>
-          </wp:inline>
-        </w:drawing>
-      </w:r>
-    </w:p>
-    <w:p>
-      <w:pPr>
-        <w:spacing w:before="60" w:after="160" w:line="240" w:lineRule="auto"/>
-        <w:jc w:val="center"/>
-        <w:rPr>
-          <w:rFonts w:cs="Times New Roman"/>
-        </w:rPr>
-      </w:pPr>
-      <w:r>
-        <w:rPr>
-          <w:rFonts w:cs="Times New Roman"/>
-          <w:i/>
-          <w:sz w:val="20"/>
-        </w:rPr>
-        <w:t>Figure 3.2a: Flowchart detail - authentication, role resolution, and administrative setup</w:t>
-      </w:r>
-    </w:p>
-    <w:p>
-      <w:pPr>
-        <w:spacing w:line="240" w:lineRule="auto"/>
-        <w:rPr>
-          <w:rFonts w:cs="Times New Roman"/>
-        </w:rPr>
-        <w:sectPr>
-          <w:type w:val="continuous"/>
-          <w:pgSz w:w="12240" w:h="15840"/>
-          <w:pgMar w:top="1296" w:right="1224" w:bottom="1152" w:left="1224" w:header="432" w:footer="504" w:gutter="0"/>
-          <w:pgNumType w:start="1"/>
-          <w:cols w:space="720"/>
-          <w:docGrid w:linePitch="360"/>
-        </w:sectPr>
-      </w:pPr>
-    </w:p>
-    <w:p>
-      <w:pPr>
-        <w:spacing w:line="240" w:lineRule="auto"/>
-        <w:rPr>
-          <w:rFonts w:cs="Times New Roman"/>
-        </w:rPr>
-        <w:sectPr>
-          <w:type w:val="continuous"/>
-          <w:pgSz w:w="12240" w:h="15840"/>
-          <w:pgMar w:top="1296" w:right="1224" w:bottom="1152" w:left="1224" w:header="432" w:footer="504" w:gutter="0"/>
-          <w:pgNumType w:start="1"/>
-          <w:cols w:space="720"/>
-          <w:docGrid w:linePitch="360"/>
-        </w:sectPr>
-      </w:pPr>
-    </w:p>
-    <w:p>
-      <w:pPr>
-        <w:spacing w:line="240" w:lineRule="auto"/>
-        <w:jc w:val="center"/>
-        <w:rPr>
-          <w:rFonts w:cs="Times New Roman"/>
-        </w:rPr>
-      </w:pPr>
-      <w:r>
-        <w:rPr>
-          <w:rFonts w:cs="Times New Roman"/>
-          <w:noProof/>
-        </w:rPr>
-        <w:lastRenderedPageBreak/>
-        <w:drawing>
-          <wp:inline distT="0" distB="0" distL="0" distR="0" wp14:anchorId="50ED0A4C" wp14:editId="30B0E49F">
-            <wp:extent cx="5989320" cy="1212493"/>
-            <wp:effectExtent l="0" t="0" r="0" b="0"/>
-            <wp:docPr id="7" name="Picture 7"/>
-            <wp:cNvGraphicFramePr>
-              <a:graphicFrameLocks xmlns:a="http://schemas.openxmlformats.org/drawingml/2006/main" noChangeAspect="1"/>
-            </wp:cNvGraphicFramePr>
-            <a:graphic xmlns:a="http://schemas.openxmlformats.org/drawingml/2006/main">
-              <a:graphicData uri="http://schemas.openxmlformats.org/drawingml/2006/picture">
-                <pic:pic xmlns:pic="http://schemas.openxmlformats.org/drawingml/2006/picture">
-                  <pic:nvPicPr>
-                    <pic:cNvPr id="0" name="flow_part_2.png"/>
-                    <pic:cNvPicPr/>
-                  </pic:nvPicPr>
-                  <pic:blipFill>
-                    <a:blip r:embed="rId15"/>
-                    <a:stretch>
-                      <a:fillRect/>
-                    </a:stretch>
-                  </pic:blipFill>
-                  <pic:spPr>
-                    <a:xfrm>
-                      <a:off x="0" y="0"/>
-                      <a:ext cx="5989320" cy="1212493"/>
-                    </a:xfrm>
-                    <a:prstGeom prst="rect">
-                      <a:avLst/>
-                    </a:prstGeom>
-                  </pic:spPr>
-                </pic:pic>
-              </a:graphicData>
-            </a:graphic>
-          </wp:inline>
-        </w:drawing>
-      </w:r>
-    </w:p>
-    <w:p>
-      <w:pPr>
-        <w:spacing w:before="60" w:after="160" w:line="240" w:lineRule="auto"/>
-        <w:jc w:val="center"/>
-        <w:rPr>
-          <w:rFonts w:cs="Times New Roman"/>
-        </w:rPr>
-      </w:pPr>
-      <w:r>
-        <w:rPr>
-          <w:rFonts w:cs="Times New Roman"/>
-          <w:i/>
-          <w:sz w:val="20"/>
-        </w:rPr>
-        <w:t>Figure 3.2b: Flowchart detail - announcement preparation, audience selection, approval, and publication</w:t>
-      </w:r>
-    </w:p>
-    <w:p>
-      <w:pPr>
-        <w:spacing w:line="240" w:lineRule="auto"/>
-        <w:rPr>
-          <w:rFonts w:cs="Times New Roman"/>
-        </w:rPr>
-        <w:sectPr>
-          <w:type w:val="continuous"/>
-          <w:pgSz w:w="12240" w:h="15840"/>
-          <w:pgMar w:top="1296" w:right="1224" w:bottom="1152" w:left="1224" w:header="432" w:footer="504" w:gutter="0"/>
-          <w:pgNumType w:start="1"/>
-          <w:cols w:space="720"/>
-          <w:docGrid w:linePitch="360"/>
-        </w:sectPr>
-      </w:pPr>
-    </w:p>
-    <w:p>
-      <w:pPr>
-        <w:spacing w:line="240" w:lineRule="auto"/>
-        <w:rPr>
-          <w:rFonts w:cs="Times New Roman"/>
-        </w:rPr>
-        <w:sectPr>
-          <w:type w:val="continuous"/>
-          <w:pgSz w:w="12240" w:h="15840"/>
-          <w:pgMar w:top="1296" w:right="1224" w:bottom="1152" w:left="1224" w:header="432" w:footer="504" w:gutter="0"/>
-          <w:pgNumType w:start="1"/>
-          <w:cols w:space="720"/>
-          <w:docGrid w:linePitch="360"/>
-        </w:sectPr>
-      </w:pPr>
-    </w:p>
-    <w:p>
-      <w:pPr>
-        <w:spacing w:line="240" w:lineRule="auto"/>
-        <w:jc w:val="center"/>
-        <w:rPr>
-          <w:rFonts w:cs="Times New Roman"/>
-        </w:rPr>
-      </w:pPr>
-      <w:r>
-        <w:rPr>
-          <w:rFonts w:cs="Times New Roman"/>
-          <w:noProof/>
-        </w:rPr>
-        <w:drawing>
-          <wp:inline distT="0" distB="0" distL="0" distR="0" wp14:anchorId="0D3F6787" wp14:editId="54736F9F">
-            <wp:extent cx="5989320" cy="1406346"/>
-            <wp:effectExtent l="0" t="0" r="0" b="0"/>
-            <wp:docPr id="8" name="Picture 8"/>
-            <wp:cNvGraphicFramePr>
-              <a:graphicFrameLocks xmlns:a="http://schemas.openxmlformats.org/drawingml/2006/main" noChangeAspect="1"/>
-            </wp:cNvGraphicFramePr>
-            <a:graphic xmlns:a="http://schemas.openxmlformats.org/drawingml/2006/main">
-              <a:graphicData uri="http://schemas.openxmlformats.org/drawingml/2006/picture">
-                <pic:pic xmlns:pic="http://schemas.openxmlformats.org/drawingml/2006/picture">
-                  <pic:nvPicPr>
-                    <pic:cNvPr id="0" name="flow_part_3.png"/>
-                    <pic:cNvPicPr/>
-                  </pic:nvPicPr>
-                  <pic:blipFill>
-                    <a:blip r:embed="rId16"/>
-                    <a:stretch>
-                      <a:fillRect/>
-                    </a:stretch>
-                  </pic:blipFill>
-                  <pic:spPr>
-                    <a:xfrm>
-                      <a:off x="0" y="0"/>
-                      <a:ext cx="5989320" cy="1406346"/>
-                    </a:xfrm>
-                    <a:prstGeom prst="rect">
-                      <a:avLst/>
-                    </a:prstGeom>
-                  </pic:spPr>
-                </pic:pic>
-              </a:graphicData>
-            </a:graphic>
-          </wp:inline>
-        </w:drawing>
-      </w:r>
-    </w:p>
-    <w:p>
-      <w:pPr>
-        <w:spacing w:before="60" w:after="160" w:line="240" w:lineRule="auto"/>
-        <w:jc w:val="center"/>
-        <w:rPr>
-          <w:rFonts w:cs="Times New Roman"/>
-        </w:rPr>
-      </w:pPr>
-      <w:r>
-        <w:rPr>
-          <w:rFonts w:cs="Times New Roman"/>
-          <w:i/>
-          <w:sz w:val="20"/>
-        </w:rPr>
-        <w:t>Figure 3.2c: Flowchart detail - messaging, academic schedules, and supporting communication processes</w:t>
-      </w:r>
-    </w:p>
-    <w:p>
-      <w:pPr>
-        <w:spacing w:line="240" w:lineRule="auto"/>
-        <w:rPr>
-          <w:rFonts w:cs="Times New Roman"/>
-        </w:rPr>
-        <w:sectPr>
-          <w:type w:val="continuous"/>
-          <w:pgSz w:w="12240" w:h="15840"/>
-          <w:pgMar w:top="1296" w:right="1224" w:bottom="1152" w:left="1224" w:header="432" w:footer="504" w:gutter="0"/>
-          <w:pgNumType w:start="1"/>
-          <w:cols w:space="720"/>
-          <w:docGrid w:linePitch="360"/>
-        </w:sectPr>
-      </w:pPr>
-    </w:p>
-    <w:p>
-      <w:pPr>
-        <w:spacing w:line="240" w:lineRule="auto"/>
-        <w:rPr>
-          <w:rFonts w:cs="Times New Roman"/>
-        </w:rPr>
-        <w:sectPr>
-          <w:type w:val="continuous"/>
-          <w:pgSz w:w="12240" w:h="15840"/>
-          <w:pgMar w:top="1296" w:right="1224" w:bottom="1152" w:left="1224" w:header="432" w:footer="504" w:gutter="0"/>
-          <w:pgNumType w:start="1"/>
-          <w:cols w:space="720"/>
-          <w:docGrid w:linePitch="360"/>
-        </w:sectPr>
-      </w:pPr>
-    </w:p>
-    <w:p>
-      <w:pPr>
-        <w:spacing w:line="240" w:lineRule="auto"/>
-        <w:jc w:val="center"/>
-        <w:rPr>
-          <w:rFonts w:cs="Times New Roman"/>
-        </w:rPr>
-      </w:pPr>
-      <w:r>
-        <w:rPr>
-          <w:rFonts w:cs="Times New Roman"/>
-          <w:noProof/>
-        </w:rPr>
-        <w:drawing>
-          <wp:inline distT="0" distB="0" distL="0" distR="0" wp14:anchorId="6B8E0ED6" wp14:editId="43DC0D0C">
-            <wp:extent cx="5989320" cy="1164386"/>
-            <wp:effectExtent l="0" t="0" r="0" b="0"/>
-            <wp:docPr id="9" name="Picture 9"/>
-            <wp:cNvGraphicFramePr>
-              <a:graphicFrameLocks xmlns:a="http://schemas.openxmlformats.org/drawingml/2006/main" noChangeAspect="1"/>
-            </wp:cNvGraphicFramePr>
-            <a:graphic xmlns:a="http://schemas.openxmlformats.org/drawingml/2006/main">
-              <a:graphicData uri="http://schemas.openxmlformats.org/drawingml/2006/picture">
-                <pic:pic xmlns:pic="http://schemas.openxmlformats.org/drawingml/2006/picture">
-                  <pic:nvPicPr>
-                    <pic:cNvPr id="0" name="flow_part_4.png"/>
-                    <pic:cNvPicPr/>
-                  </pic:nvPicPr>
-                  <pic:blipFill>
-                    <a:blip r:embed="rId17"/>
-                    <a:stretch>
-                      <a:fillRect/>
-                    </a:stretch>
-                  </pic:blipFill>
-                  <pic:spPr>
-                    <a:xfrm>
-                      <a:off x="0" y="0"/>
-                      <a:ext cx="5989320" cy="1164386"/>
-                    </a:xfrm>
-                    <a:prstGeom prst="rect">
-                      <a:avLst/>
-                    </a:prstGeom>
-                  </pic:spPr>
-                </pic:pic>
-              </a:graphicData>
-            </a:graphic>
-          </wp:inline>
-        </w:drawing>
-      </w:r>
-    </w:p>
-    <w:p>
-      <w:pPr>
-        <w:spacing w:before="60" w:after="160" w:line="240" w:lineRule="auto"/>
-        <w:jc w:val="center"/>
-        <w:rPr>
-          <w:rFonts w:cs="Times New Roman"/>
-        </w:rPr>
-      </w:pPr>
-      <w:r>
-        <w:rPr>
-          <w:rFonts w:cs="Times New Roman"/>
-          <w:i/>
-          <w:sz w:val="20"/>
-        </w:rPr>
-        <w:t>Figure 3.2d: Flowchart detail - notification creation, external delivery, and user interaction</w:t>
-      </w:r>
-    </w:p>
-    <w:p>
-      <w:pPr>
-        <w:spacing w:line="240" w:lineRule="auto"/>
-        <w:rPr>
-          <w:rFonts w:cs="Times New Roman"/>
-        </w:rPr>
-        <w:sectPr>
-          <w:type w:val="continuous"/>
-          <w:pgSz w:w="12240" w:h="15840"/>
-          <w:pgMar w:top="1296" w:right="1224" w:bottom="1152" w:left="1224" w:header="432" w:footer="504" w:gutter="0"/>
-          <w:pgNumType w:start="1"/>
-          <w:cols w:space="720"/>
-          <w:docGrid w:linePitch="360"/>
-        </w:sectPr>
-      </w:pPr>
-    </w:p>
-    <w:p>
-      <w:pPr>
-        <w:spacing w:line="240" w:lineRule="auto"/>
-        <w:rPr>
-          <w:rFonts w:cs="Times New Roman"/>
-        </w:rPr>
-        <w:sectPr>
-          <w:type w:val="continuous"/>
-          <w:pgSz w:w="12240" w:h="15840"/>
-          <w:pgMar w:top="1296" w:right="1224" w:bottom="1152" w:left="1224" w:header="432" w:footer="504" w:gutter="0"/>
-          <w:pgNumType w:start="1"/>
-          <w:cols w:space="720"/>
-          <w:docGrid w:linePitch="360"/>
-        </w:sectPr>
-      </w:pPr>
-    </w:p>
-    <w:p>
-      <w:pPr>
-        <w:spacing w:line="240" w:lineRule="auto"/>
-        <w:jc w:val="center"/>
-        <w:rPr>
-          <w:rFonts w:cs="Times New Roman"/>
-        </w:rPr>
-      </w:pPr>
-      <w:r>
-        <w:rPr>
-          <w:rFonts w:cs="Times New Roman"/>
-          <w:noProof/>
-        </w:rPr>
-        <w:drawing>
-          <wp:inline distT="0" distB="0" distL="0" distR="0" wp14:anchorId="6BED4F03" wp14:editId="09FD1523">
-            <wp:extent cx="5989320" cy="910624"/>
-            <wp:effectExtent l="0" t="0" r="0" b="0"/>
-            <wp:docPr id="10" name="Picture 10"/>
-            <wp:cNvGraphicFramePr>
-              <a:graphicFrameLocks xmlns:a="http://schemas.openxmlformats.org/drawingml/2006/main" noChangeAspect="1"/>
-            </wp:cNvGraphicFramePr>
-            <a:graphic xmlns:a="http://schemas.openxmlformats.org/drawingml/2006/main">
-              <a:graphicData uri="http://schemas.openxmlformats.org/drawingml/2006/picture">
-                <pic:pic xmlns:pic="http://schemas.openxmlformats.org/drawingml/2006/picture">
-                  <pic:nvPicPr>
-                    <pic:cNvPr id="0" name="flow_part_5.png"/>
-                    <pic:cNvPicPr/>
-                  </pic:nvPicPr>
-                  <pic:blipFill>
-                    <a:blip r:embed="rId18"/>
-                    <a:stretch>
-                      <a:fillRect/>
-                    </a:stretch>
-                  </pic:blipFill>
-                  <pic:spPr>
-                    <a:xfrm>
-                      <a:off x="0" y="0"/>
-                      <a:ext cx="5989320" cy="910624"/>
-                    </a:xfrm>
-                    <a:prstGeom prst="rect">
-                      <a:avLst/>
-                    </a:prstGeom>
-                  </pic:spPr>
-                </pic:pic>
-              </a:graphicData>
-            </a:graphic>
-          </wp:inline>
-        </w:drawing>
-      </w:r>
-    </w:p>
-    <w:p>
-      <w:pPr>
-        <w:spacing w:before="60" w:after="160" w:line="240" w:lineRule="auto"/>
-        <w:jc w:val="center"/>
-        <w:rPr>
-          <w:rFonts w:cs="Times New Roman"/>
-        </w:rPr>
-      </w:pPr>
-      <w:r>
-        <w:rPr>
-          <w:rFonts w:cs="Times New Roman"/>
-          <w:i/>
-          <w:sz w:val="20"/>
-        </w:rPr>
-        <w:t>Figure 3.2e: Flowchart detail - read tracking, reporting, audit records, and data persistence</w:t>
-      </w:r>
-    </w:p>
-    <w:p>
-      <w:pPr>
-        <w:spacing w:line="240" w:lineRule="auto"/>
-        <w:rPr>
-          <w:rFonts w:cs="Times New Roman"/>
-        </w:rPr>
-        <w:sectPr>
-          <w:type w:val="continuous"/>
-          <w:pgSz w:w="12240" w:h="15840"/>
-          <w:pgMar w:top="1296" w:right="1224" w:bottom="1152" w:left="1224" w:header="432" w:footer="504" w:gutter="0"/>
-          <w:pgNumType w:start="1"/>
-          <w:cols w:space="720"/>
-          <w:docGrid w:linePitch="360"/>
-        </w:sectPr>
-      </w:pPr>
-    </w:p>
-    <w:p>
-      <w:pPr>
-        <w:pStyle w:val="Heading4"/>
-        <w:spacing w:line="240" w:lineRule="auto"/>
-        <w:rPr>
-          <w:rFonts w:cs="Times New Roman"/>
-        </w:rPr>
-      </w:pPr>
-      <w:r>
-        <w:rPr>
-          <w:rFonts w:cs="Times New Roman"/>
-        </w:rPr>
-        <w:t>3.8.3.3 Entity-Relationship Diagram and Database Design</w:t>
-      </w:r>
-    </w:p>
-    <w:p>
-      <w:pPr>
-        <w:spacing w:line="240" w:lineRule="auto"/>
-        <w:ind w:firstLine="461"/>
-        <w:rPr>
-          <w:rFonts w:cs="Times New Roman"/>
-        </w:rPr>
-      </w:pPr>
-      <w:r>
-        <w:rPr>
-          <w:rFonts w:cs="Times New Roman"/>
-        </w:rPr>
-        <w:t>The Entity-Relationship Diagram defines the data required to preserve users, roles, permissions, institutional structures, announcements, audiences, recipients, attachments, messages, threads, schedules, notifications, delivery records, preferences, sessions, reports, and audit logs. Primary keys identify records, while foreign keys and join entities preserve many-to-many relationships such as users and roles, roles and permissions, announcements and audiences, threads and participants, students and courses, and notices and recipients.</w:t>
-      </w:r>
-    </w:p>
-    <w:p>
-      <w:pPr>
-        <w:spacing w:line="240" w:lineRule="auto"/>
-        <w:rPr>
-          <w:rFonts w:cs="Times New Roman"/>
-        </w:rPr>
-        <w:sectPr>
-          <w:type w:val="continuous"/>
-          <w:pgSz w:w="12240" w:h="15840"/>
-          <w:pgMar w:top="1296" w:right="1224" w:bottom="1152" w:left="1224" w:header="432" w:footer="504" w:gutter="0"/>
-          <w:pgNumType w:start="1"/>
-          <w:cols w:space="720"/>
-          <w:docGrid w:linePitch="360"/>
-        </w:sectPr>
-      </w:pPr>
-    </w:p>
-    <w:p>
-      <w:pPr>
-        <w:spacing w:line="240" w:lineRule="auto"/>
-        <w:jc w:val="center"/>
-        <w:rPr>
-          <w:rFonts w:cs="Times New Roman"/>
-        </w:rPr>
-      </w:pPr>
-      <w:r>
-        <w:rPr>
-          <w:rFonts w:cs="Times New Roman"/>
-          <w:noProof/>
-        </w:rPr>
-        <w:lastRenderedPageBreak/>
-        <w:drawing>
-          <wp:inline distT="0" distB="0" distL="0" distR="0" wp14:anchorId="4D209AAF" wp14:editId="76DB0389">
-            <wp:extent cx="5160233" cy="7086600"/>
-            <wp:effectExtent l="0" t="0" r="0" b="0"/>
-            <wp:docPr id="11" name="Picture 11"/>
-            <wp:cNvGraphicFramePr>
-              <a:graphicFrameLocks xmlns:a="http://schemas.openxmlformats.org/drawingml/2006/main" noChangeAspect="1"/>
-            </wp:cNvGraphicFramePr>
-            <a:graphic xmlns:a="http://schemas.openxmlformats.org/drawingml/2006/main">
-              <a:graphicData uri="http://schemas.openxmlformats.org/drawingml/2006/picture">
-                <pic:pic xmlns:pic="http://schemas.openxmlformats.org/drawingml/2006/picture">
-                  <pic:nvPicPr>
-                    <pic:cNvPr id="0" name="erd_overview.png"/>
-                    <pic:cNvPicPr/>
-                  </pic:nvPicPr>
-                  <pic:blipFill>
-                    <a:blip r:embed="rId19"/>
-                    <a:stretch>
-                      <a:fillRect/>
-                    </a:stretch>
-                  </pic:blipFill>
-                  <pic:spPr>
-                    <a:xfrm>
-                      <a:off x="0" y="0"/>
-                      <a:ext cx="5160233" cy="7086600"/>
-                    </a:xfrm>
-                    <a:prstGeom prst="rect">
-                      <a:avLst/>
-                    </a:prstGeom>
-                  </pic:spPr>
-                </pic:pic>
-              </a:graphicData>
-            </a:graphic>
-          </wp:inline>
-        </w:drawing>
-      </w:r>
-    </w:p>
-    <w:p>
-      <w:pPr>
-        <w:spacing w:before="60" w:after="160" w:line="240" w:lineRule="auto"/>
-        <w:jc w:val="center"/>
-        <w:rPr>
-          <w:rFonts w:cs="Times New Roman"/>
-        </w:rPr>
-      </w:pPr>
-      <w:r>
-        <w:rPr>
-          <w:rFonts w:cs="Times New Roman"/>
-          <w:i/>
-          <w:sz w:val="20"/>
-        </w:rPr>
         <w:t>Figure 3.3: Entity-Relationship Diagram of the Smart Information Dissemination System</w:t>
-      </w:r>
-    </w:p>
-    <w:p>
-      <w:pPr>
-        <w:spacing w:line="240" w:lineRule="auto"/>
-        <w:rPr>
-          <w:rFonts w:cs="Times New Roman"/>
-        </w:rPr>
-        <w:sectPr>
-          <w:type w:val="continuous"/>
-          <w:pgSz w:w="12240" w:h="15840"/>
-          <w:pgMar w:top="1296" w:right="1224" w:bottom="1152" w:left="1224" w:header="432" w:footer="504" w:gutter="0"/>
-          <w:pgNumType w:start="1"/>
-          <w:cols w:space="720"/>
-          <w:docGrid w:linePitch="360"/>
-        </w:sectPr>
-      </w:pPr>
-    </w:p>
-    <w:p>
-      <w:pPr>
-        <w:spacing w:line="240" w:lineRule="auto"/>
-        <w:rPr>
-          <w:rFonts w:cs="Times New Roman"/>
-        </w:rPr>
-        <w:sectPr>
-          <w:type w:val="continuous"/>
-          <w:pgSz w:w="12240" w:h="15840"/>
-          <w:pgMar w:top="1296" w:right="1224" w:bottom="1152" w:left="1224" w:header="432" w:footer="504" w:gutter="0"/>
-          <w:pgNumType w:start="1"/>
-          <w:cols w:space="720"/>
-          <w:docGrid w:linePitch="360"/>
-        </w:sectPr>
-      </w:pPr>
-    </w:p>
-    <w:p>
-      <w:pPr>
-        <w:spacing w:line="240" w:lineRule="auto"/>
-        <w:jc w:val="center"/>
-        <w:rPr>
-          <w:rFonts w:cs="Times New Roman"/>
-        </w:rPr>
-      </w:pPr>
-      <w:r>
-        <w:rPr>
-          <w:rFonts w:cs="Times New Roman"/>
-          <w:noProof/>
-        </w:rPr>
-        <w:lastRenderedPageBreak/>
-        <w:drawing>
-          <wp:inline distT="0" distB="0" distL="0" distR="0" wp14:anchorId="4B23A86A" wp14:editId="3200B7E9">
-            <wp:extent cx="4671863" cy="7086600"/>
-            <wp:effectExtent l="0" t="0" r="0" b="0"/>
-            <wp:docPr id="12" name="Picture 12"/>
-            <wp:cNvGraphicFramePr>
-              <a:graphicFrameLocks xmlns:a="http://schemas.openxmlformats.org/drawingml/2006/main" noChangeAspect="1"/>
-            </wp:cNvGraphicFramePr>
-            <a:graphic xmlns:a="http://schemas.openxmlformats.org/drawingml/2006/main">
-              <a:graphicData uri="http://schemas.openxmlformats.org/drawingml/2006/picture">
-                <pic:pic xmlns:pic="http://schemas.openxmlformats.org/drawingml/2006/picture">
-                  <pic:nvPicPr>
-                    <pic:cNvPr id="0" name="erd_part_1.png"/>
-                    <pic:cNvPicPr/>
-                  </pic:nvPicPr>
-                  <pic:blipFill>
-                    <a:blip r:embed="rId20"/>
-                    <a:stretch>
-                      <a:fillRect/>
-                    </a:stretch>
-                  </pic:blipFill>
-                  <pic:spPr>
-                    <a:xfrm>
-                      <a:off x="0" y="0"/>
-                      <a:ext cx="4671863" cy="7086600"/>
-                    </a:xfrm>
-                    <a:prstGeom prst="rect">
-                      <a:avLst/>
-                    </a:prstGeom>
-                  </pic:spPr>
-                </pic:pic>
-              </a:graphicData>
-            </a:graphic>
-          </wp:inline>
-        </w:drawing>
-      </w:r>
-    </w:p>
-    <w:p>
-      <w:pPr>
-        <w:spacing w:before="60" w:after="160" w:line="240" w:lineRule="auto"/>
-        <w:jc w:val="center"/>
-        <w:rPr>
-          <w:rFonts w:cs="Times New Roman"/>
-        </w:rPr>
-      </w:pPr>
-      <w:r>
-        <w:rPr>
-          <w:rFonts w:cs="Times New Roman"/>
-          <w:i/>
-          <w:sz w:val="20"/>
-        </w:rPr>
-        <w:t>Figure 3.3a: ERD detail - permissions, authentication, user accounts, and core communication entities</w:t>
-      </w:r>
-    </w:p>
-    <w:p>
-      <w:pPr>
-        <w:spacing w:line="240" w:lineRule="auto"/>
-        <w:rPr>
-          <w:rFonts w:cs="Times New Roman"/>
-        </w:rPr>
-        <w:sectPr>
-          <w:type w:val="continuous"/>
-          <w:pgSz w:w="12240" w:h="15840"/>
-          <w:pgMar w:top="1296" w:right="1224" w:bottom="1152" w:left="1224" w:header="432" w:footer="504" w:gutter="0"/>
-          <w:pgNumType w:start="1"/>
-          <w:cols w:space="720"/>
-          <w:docGrid w:linePitch="360"/>
-        </w:sectPr>
-      </w:pPr>
-    </w:p>
-    <w:p>
-      <w:pPr>
-        <w:spacing w:line="240" w:lineRule="auto"/>
-        <w:rPr>
-          <w:rFonts w:cs="Times New Roman"/>
-        </w:rPr>
-        <w:sectPr>
-          <w:type w:val="continuous"/>
-          <w:pgSz w:w="12240" w:h="15840"/>
-          <w:pgMar w:top="1296" w:right="1224" w:bottom="1152" w:left="1224" w:header="432" w:footer="504" w:gutter="0"/>
-          <w:pgNumType w:start="1"/>
-          <w:cols w:space="720"/>
-          <w:docGrid w:linePitch="360"/>
-        </w:sectPr>
-      </w:pPr>
-    </w:p>
-    <w:p>
-      <w:pPr>
-        <w:spacing w:line="240" w:lineRule="auto"/>
-        <w:jc w:val="center"/>
-        <w:rPr>
-          <w:rFonts w:cs="Times New Roman"/>
-        </w:rPr>
-      </w:pPr>
-      <w:r>
-        <w:rPr>
-          <w:rFonts w:cs="Times New Roman"/>
-          <w:noProof/>
-        </w:rPr>
-        <w:lastRenderedPageBreak/>
-        <w:drawing>
-          <wp:inline distT="0" distB="0" distL="0" distR="0" wp14:anchorId="609C3178" wp14:editId="6322C1E7">
-            <wp:extent cx="5989320" cy="5709958"/>
-            <wp:effectExtent l="0" t="0" r="0" b="0"/>
-            <wp:docPr id="13" name="Picture 13"/>
-            <wp:cNvGraphicFramePr>
-              <a:graphicFrameLocks xmlns:a="http://schemas.openxmlformats.org/drawingml/2006/main" noChangeAspect="1"/>
-            </wp:cNvGraphicFramePr>
-            <a:graphic xmlns:a="http://schemas.openxmlformats.org/drawingml/2006/main">
-              <a:graphicData uri="http://schemas.openxmlformats.org/drawingml/2006/picture">
-                <pic:pic xmlns:pic="http://schemas.openxmlformats.org/drawingml/2006/picture">
-                  <pic:nvPicPr>
-                    <pic:cNvPr id="0" name="erd_part_2.png"/>
-                    <pic:cNvPicPr/>
-                  </pic:nvPicPr>
-                  <pic:blipFill>
-                    <a:blip r:embed="rId21"/>
-                    <a:stretch>
-                      <a:fillRect/>
-                    </a:stretch>
-                  </pic:blipFill>
-                  <pic:spPr>
-                    <a:xfrm>
-                      <a:off x="0" y="0"/>
-                      <a:ext cx="5989320" cy="5709958"/>
-                    </a:xfrm>
-                    <a:prstGeom prst="rect">
-                      <a:avLst/>
-                    </a:prstGeom>
-                  </pic:spPr>
-                </pic:pic>
-              </a:graphicData>
-            </a:graphic>
-          </wp:inline>
-        </w:drawing>
-      </w:r>
-    </w:p>
-    <w:p>
-      <w:pPr>
-        <w:spacing w:before="60" w:after="160" w:line="240" w:lineRule="auto"/>
-        <w:jc w:val="center"/>
-        <w:rPr>
-          <w:rFonts w:cs="Times New Roman"/>
-        </w:rPr>
-      </w:pPr>
-      <w:r>
-        <w:rPr>
-          <w:rFonts w:cs="Times New Roman"/>
-          <w:i/>
-          <w:sz w:val="20"/>
-        </w:rPr>
-        <w:t>Figure 3.3b: ERD detail - announcements, recipients, attachments, messages, and message participants</w:t>
-      </w:r>
-    </w:p>
-    <w:p>
-      <w:pPr>
-        <w:spacing w:line="240" w:lineRule="auto"/>
-        <w:rPr>
-          <w:rFonts w:cs="Times New Roman"/>
-        </w:rPr>
-        <w:sectPr>
-          <w:type w:val="continuous"/>
-          <w:pgSz w:w="12240" w:h="15840"/>
-          <w:pgMar w:top="1296" w:right="1224" w:bottom="1152" w:left="1224" w:header="432" w:footer="504" w:gutter="0"/>
-          <w:pgNumType w:start="1"/>
-          <w:cols w:space="720"/>
-          <w:docGrid w:linePitch="360"/>
-        </w:sectPr>
-      </w:pPr>
-    </w:p>
-    <w:p>
-      <w:pPr>
-        <w:spacing w:line="240" w:lineRule="auto"/>
-        <w:rPr>
-          <w:rFonts w:cs="Times New Roman"/>
-        </w:rPr>
-        <w:sectPr>
-          <w:type w:val="continuous"/>
-          <w:pgSz w:w="12240" w:h="15840"/>
-          <w:pgMar w:top="1296" w:right="1224" w:bottom="1152" w:left="1224" w:header="432" w:footer="504" w:gutter="0"/>
-          <w:pgNumType w:start="1"/>
-          <w:cols w:space="720"/>
-          <w:docGrid w:linePitch="360"/>
-        </w:sectPr>
-      </w:pPr>
-    </w:p>
-    <w:p>
-      <w:pPr>
-        <w:spacing w:line="240" w:lineRule="auto"/>
-        <w:jc w:val="center"/>
-        <w:rPr>
-          <w:rFonts w:cs="Times New Roman"/>
-        </w:rPr>
-      </w:pPr>
-      <w:r>
-        <w:rPr>
-          <w:rFonts w:cs="Times New Roman"/>
-          <w:noProof/>
-        </w:rPr>
-        <w:lastRenderedPageBreak/>
-        <w:drawing>
-          <wp:inline distT="0" distB="0" distL="0" distR="0" wp14:anchorId="477597AE" wp14:editId="0548C31C">
-            <wp:extent cx="5989320" cy="5371456"/>
-            <wp:effectExtent l="0" t="0" r="0" b="0"/>
-            <wp:docPr id="14" name="Picture 14"/>
-            <wp:cNvGraphicFramePr>
-              <a:graphicFrameLocks xmlns:a="http://schemas.openxmlformats.org/drawingml/2006/main" noChangeAspect="1"/>
-            </wp:cNvGraphicFramePr>
-            <a:graphic xmlns:a="http://schemas.openxmlformats.org/drawingml/2006/main">
-              <a:graphicData uri="http://schemas.openxmlformats.org/drawingml/2006/picture">
-                <pic:pic xmlns:pic="http://schemas.openxmlformats.org/drawingml/2006/picture">
-                  <pic:nvPicPr>
-                    <pic:cNvPr id="0" name="erd_part_3.png"/>
-                    <pic:cNvPicPr/>
-                  </pic:nvPicPr>
-                  <pic:blipFill>
-                    <a:blip r:embed="rId22"/>
-                    <a:stretch>
-                      <a:fillRect/>
-                    </a:stretch>
-                  </pic:blipFill>
-                  <pic:spPr>
-                    <a:xfrm>
-                      <a:off x="0" y="0"/>
-                      <a:ext cx="5989320" cy="5371456"/>
-                    </a:xfrm>
-                    <a:prstGeom prst="rect">
-                      <a:avLst/>
-                    </a:prstGeom>
-                  </pic:spPr>
-                </pic:pic>
-              </a:graphicData>
-            </a:graphic>
-          </wp:inline>
-        </w:drawing>
-      </w:r>
-    </w:p>
-    <w:p>
-      <w:pPr>
-        <w:spacing w:before="60" w:after="160" w:line="240" w:lineRule="auto"/>
-        <w:jc w:val="center"/>
-        <w:rPr>
-          <w:rFonts w:cs="Times New Roman"/>
-        </w:rPr>
-      </w:pPr>
-      <w:r>
-        <w:rPr>
-          <w:rFonts w:cs="Times New Roman"/>
-          <w:i/>
-          <w:sz w:val="20"/>
-        </w:rPr>
-        <w:t>Figure 3.3c: ERD detail - sessions, notification preferences, audit logs, and delivery-related entities</w:t>
-      </w:r>
-    </w:p>
-    <w:p>
-      <w:pPr>
-        <w:spacing w:line="240" w:lineRule="auto"/>
-        <w:rPr>
-          <w:rFonts w:cs="Times New Roman"/>
-        </w:rPr>
-        <w:sectPr>
-          <w:type w:val="continuous"/>
-          <w:pgSz w:w="12240" w:h="15840"/>
-          <w:pgMar w:top="1296" w:right="1224" w:bottom="1152" w:left="1224" w:header="432" w:footer="504" w:gutter="0"/>
-          <w:pgNumType w:start="1"/>
-          <w:cols w:space="720"/>
-          <w:docGrid w:linePitch="360"/>
-        </w:sectPr>
-      </w:pPr>
-    </w:p>
-    <w:p>
-      <w:pPr>
-        <w:spacing w:line="240" w:lineRule="auto"/>
-        <w:rPr>
-          <w:rFonts w:cs="Times New Roman"/>
-        </w:rPr>
-        <w:sectPr>
-          <w:type w:val="continuous"/>
-          <w:pgSz w:w="12240" w:h="15840"/>
-          <w:pgMar w:top="1296" w:right="1224" w:bottom="1152" w:left="1224" w:header="432" w:footer="504" w:gutter="0"/>
-          <w:pgNumType w:start="1"/>
-          <w:cols w:space="720"/>
-          <w:docGrid w:linePitch="360"/>
-        </w:sectPr>
-      </w:pPr>
-    </w:p>
-    <w:p>
-      <w:pPr>
-        <w:spacing w:line="240" w:lineRule="auto"/>
-        <w:jc w:val="center"/>
-        <w:rPr>
-          <w:rFonts w:cs="Times New Roman"/>
-        </w:rPr>
-      </w:pPr>
-      <w:r>
-        <w:rPr>
-          <w:rFonts w:cs="Times New Roman"/>
-          <w:noProof/>
-        </w:rPr>
-        <w:lastRenderedPageBreak/>
-        <w:drawing>
-          <wp:inline distT="0" distB="0" distL="0" distR="0" wp14:anchorId="5371B4EE" wp14:editId="4C36EB4C">
-            <wp:extent cx="5989320" cy="6843089"/>
-            <wp:effectExtent l="0" t="0" r="0" b="0"/>
-            <wp:docPr id="15" name="Picture 15"/>
-            <wp:cNvGraphicFramePr>
-              <a:graphicFrameLocks xmlns:a="http://schemas.openxmlformats.org/drawingml/2006/main" noChangeAspect="1"/>
-            </wp:cNvGraphicFramePr>
-            <a:graphic xmlns:a="http://schemas.openxmlformats.org/drawingml/2006/main">
-              <a:graphicData uri="http://schemas.openxmlformats.org/drawingml/2006/picture">
-                <pic:pic xmlns:pic="http://schemas.openxmlformats.org/drawingml/2006/picture">
-                  <pic:nvPicPr>
-                    <pic:cNvPr id="0" name="erd_part_4.png"/>
-                    <pic:cNvPicPr/>
-                  </pic:nvPicPr>
-                  <pic:blipFill>
-                    <a:blip r:embed="rId23"/>
-                    <a:stretch>
-                      <a:fillRect/>
-                    </a:stretch>
-                  </pic:blipFill>
-                  <pic:spPr>
-                    <a:xfrm>
-                      <a:off x="0" y="0"/>
-                      <a:ext cx="5989320" cy="6843089"/>
-                    </a:xfrm>
-                    <a:prstGeom prst="rect">
-                      <a:avLst/>
-                    </a:prstGeom>
-                  </pic:spPr>
-                </pic:pic>
-              </a:graphicData>
-            </a:graphic>
-          </wp:inline>
-        </w:drawing>
-      </w:r>
-    </w:p>
-    <w:p>
-      <w:pPr>
-        <w:spacing w:before="60" w:after="160" w:line="240" w:lineRule="auto"/>
-        <w:jc w:val="center"/>
-        <w:rPr>
-          <w:rFonts w:cs="Times New Roman"/>
-        </w:rPr>
-      </w:pPr>
-      <w:r>
-        <w:rPr>
-          <w:rFonts w:cs="Times New Roman"/>
-          <w:i/>
-          <w:sz w:val="20"/>
-        </w:rPr>
-        <w:t>Figure 3.3d: ERD detail - notifications, academic audiences, and announcement-audience relationships</w:t>
-      </w:r>
-    </w:p>
-    <w:p>
-      <w:pPr>
-        <w:spacing w:line="240" w:lineRule="auto"/>
-        <w:rPr>
-          <w:rFonts w:cs="Times New Roman"/>
-        </w:rPr>
-        <w:sectPr>
-          <w:type w:val="continuous"/>
-          <w:pgSz w:w="12240" w:h="15840"/>
-          <w:pgMar w:top="1296" w:right="1224" w:bottom="1152" w:left="1224" w:header="432" w:footer="504" w:gutter="0"/>
-          <w:pgNumType w:start="1"/>
-          <w:cols w:space="720"/>
-          <w:docGrid w:linePitch="360"/>
-        </w:sectPr>
-      </w:pPr>
-    </w:p>
-    <w:p>
-      <w:pPr>
-        <w:spacing w:line="240" w:lineRule="auto"/>
-        <w:rPr>
-          <w:rFonts w:cs="Times New Roman"/>
-        </w:rPr>
-        <w:sectPr>
-          <w:type w:val="continuous"/>
-          <w:pgSz w:w="12240" w:h="15840"/>
-          <w:pgMar w:top="1296" w:right="1224" w:bottom="1152" w:left="1224" w:header="432" w:footer="504" w:gutter="0"/>
-          <w:pgNumType w:start="1"/>
-          <w:cols w:space="720"/>
-          <w:docGrid w:linePitch="360"/>
-        </w:sectPr>
-      </w:pPr>
-    </w:p>
-    <w:p>
-      <w:pPr>
-        <w:spacing w:line="240" w:lineRule="auto"/>
-        <w:jc w:val="center"/>
-        <w:rPr>
-          <w:rFonts w:cs="Times New Roman"/>
-        </w:rPr>
-      </w:pPr>
-      <w:r>
-        <w:rPr>
-          <w:rFonts w:cs="Times New Roman"/>
-          <w:noProof/>
-        </w:rPr>
-        <w:lastRenderedPageBreak/>
-        <w:drawing>
-          <wp:inline distT="0" distB="0" distL="0" distR="0" wp14:anchorId="71ED9E78" wp14:editId="43E555F5">
-            <wp:extent cx="5989320" cy="4556539"/>
-            <wp:effectExtent l="0" t="0" r="0" b="0"/>
-            <wp:docPr id="16" name="Picture 16"/>
-            <wp:cNvGraphicFramePr>
-              <a:graphicFrameLocks xmlns:a="http://schemas.openxmlformats.org/drawingml/2006/main" noChangeAspect="1"/>
-            </wp:cNvGraphicFramePr>
-            <a:graphic xmlns:a="http://schemas.openxmlformats.org/drawingml/2006/main">
-              <a:graphicData uri="http://schemas.openxmlformats.org/drawingml/2006/picture">
-                <pic:pic xmlns:pic="http://schemas.openxmlformats.org/drawingml/2006/picture">
-                  <pic:nvPicPr>
-                    <pic:cNvPr id="0" name="erd_part_5.png"/>
-                    <pic:cNvPicPr/>
-                  </pic:nvPicPr>
-                  <pic:blipFill>
-                    <a:blip r:embed="rId24"/>
-                    <a:stretch>
-                      <a:fillRect/>
-                    </a:stretch>
-                  </pic:blipFill>
-                  <pic:spPr>
-                    <a:xfrm>
-                      <a:off x="0" y="0"/>
-                      <a:ext cx="5989320" cy="4556539"/>
-                    </a:xfrm>
-                    <a:prstGeom prst="rect">
-                      <a:avLst/>
-                    </a:prstGeom>
-                  </pic:spPr>
-                </pic:pic>
-              </a:graphicData>
-            </a:graphic>
-          </wp:inline>
-        </w:drawing>
-      </w:r>
-    </w:p>
-    <w:p>
-      <w:pPr>
-        <w:spacing w:before="60" w:after="160" w:line="240" w:lineRule="auto"/>
-        <w:jc w:val="center"/>
-        <w:rPr>
-          <w:rFonts w:cs="Times New Roman"/>
-        </w:rPr>
-      </w:pPr>
-      <w:r>
-        <w:rPr>
-          <w:rFonts w:cs="Times New Roman"/>
-          <w:i/>
-          <w:sz w:val="20"/>
-        </w:rPr>
-        <w:t>Figure 3.3e: ERD detail - institution, faculty, department, programme, course, and academic period entities</w:t>
-      </w:r>
-    </w:p>
-    <w:p>
-      <w:pPr>
-        <w:spacing w:line="240" w:lineRule="auto"/>
-        <w:rPr>
-          <w:rFonts w:cs="Times New Roman"/>
-        </w:rPr>
-        <w:sectPr>
-          <w:type w:val="continuous"/>
-          <w:pgSz w:w="12240" w:h="15840"/>
-          <w:pgMar w:top="1296" w:right="1224" w:bottom="1152" w:left="1224" w:header="432" w:footer="504" w:gutter="0"/>
-          <w:pgNumType w:start="1"/>
-          <w:cols w:space="720"/>
-          <w:docGrid w:linePitch="360"/>
-        </w:sectPr>
-      </w:pPr>
-    </w:p>
-    <w:p>
-      <w:pPr>
-        <w:spacing w:line="240" w:lineRule="auto"/>
-        <w:rPr>
-          <w:rFonts w:cs="Times New Roman"/>
-        </w:rPr>
-        <w:sectPr>
-          <w:type w:val="continuous"/>
-          <w:pgSz w:w="12240" w:h="15840"/>
-          <w:pgMar w:top="1296" w:right="1224" w:bottom="1152" w:left="1224" w:header="432" w:footer="504" w:gutter="0"/>
-          <w:pgNumType w:start="1"/>
-          <w:cols w:space="720"/>
-          <w:docGrid w:linePitch="360"/>
-        </w:sectPr>
-      </w:pPr>
-    </w:p>
-    <w:p>
-      <w:pPr>
-        <w:spacing w:line="240" w:lineRule="auto"/>
-        <w:jc w:val="center"/>
-        <w:rPr>
-          <w:rFonts w:cs="Times New Roman"/>
-        </w:rPr>
-      </w:pPr>
-      <w:r>
-        <w:rPr>
-          <w:rFonts w:cs="Times New Roman"/>
-          <w:noProof/>
-        </w:rPr>
-        <w:lastRenderedPageBreak/>
-        <w:drawing>
-          <wp:inline distT="0" distB="0" distL="0" distR="0" wp14:anchorId="501F754A" wp14:editId="61E37731">
-            <wp:extent cx="5989320" cy="4224533"/>
-            <wp:effectExtent l="0" t="0" r="0" b="0"/>
-            <wp:docPr id="17" name="Picture 17"/>
-            <wp:cNvGraphicFramePr>
-              <a:graphicFrameLocks xmlns:a="http://schemas.openxmlformats.org/drawingml/2006/main" noChangeAspect="1"/>
-            </wp:cNvGraphicFramePr>
-            <a:graphic xmlns:a="http://schemas.openxmlformats.org/drawingml/2006/main">
-              <a:graphicData uri="http://schemas.openxmlformats.org/drawingml/2006/picture">
-                <pic:pic xmlns:pic="http://schemas.openxmlformats.org/drawingml/2006/picture">
-                  <pic:nvPicPr>
-                    <pic:cNvPr id="0" name="erd_part_6.png"/>
-                    <pic:cNvPicPr/>
-                  </pic:nvPicPr>
-                  <pic:blipFill>
-                    <a:blip r:embed="rId25"/>
-                    <a:stretch>
-                      <a:fillRect/>
-                    </a:stretch>
-                  </pic:blipFill>
-                  <pic:spPr>
-                    <a:xfrm>
-                      <a:off x="0" y="0"/>
-                      <a:ext cx="5989320" cy="4224533"/>
-                    </a:xfrm>
-                    <a:prstGeom prst="rect">
-                      <a:avLst/>
-                    </a:prstGeom>
-                  </pic:spPr>
-                </pic:pic>
-              </a:graphicData>
-            </a:graphic>
-          </wp:inline>
-        </w:drawing>
-      </w:r>
-    </w:p>
-    <w:p>
-      <w:pPr>
-        <w:spacing w:before="60" w:after="160" w:line="240" w:lineRule="auto"/>
-        <w:jc w:val="center"/>
-        <w:rPr>
-          <w:rFonts w:cs="Times New Roman"/>
-        </w:rPr>
-      </w:pPr>
-      <w:r>
-        <w:rPr>
-          <w:rFonts w:cs="Times New Roman"/>
-          <w:i/>
-          <w:sz w:val="20"/>
-        </w:rPr>
-        <w:t>Figure 3.3f: ERD detail - course enrolment, lecturer assignments, student audiences, and academic schedules</w:t>
       </w:r>
     </w:p>
     <w:p>
@@ -6520,6 +5367,7 @@
         <w:rPr>
           <w:rFonts w:cs="Times New Roman"/>
         </w:rPr>
+        <w:lastRenderedPageBreak/>
         <w:t>3.8.4 Implementation Phase</w:t>
       </w:r>
     </w:p>
@@ -6565,7 +5413,6 @@
         <w:rPr>
           <w:rFonts w:cs="Times New Roman"/>
         </w:rPr>
-        <w:lastRenderedPageBreak/>
         <w:t>3.9 Testing, Deployment, and Maintenance Plan</w:t>
       </w:r>
     </w:p>

</xml_diff>